<commit_message>
Examples: write Word's page-start marks into the styled .docx by laying it out with LibreOffice, so it can be shown page by page like a file saved by Word
</commit_message>
<xml_diff>
--- a/examples/library-lending/requirements-styled.docx
+++ b/examples/library-lending/requirements-styled.docx
@@ -58,6 +58,9 @@
       <w:pPr>
         <w:pStyle w:val="Heading1"/>
       </w:pPr>
+      <w:r>
+        <w:lastRenderedPageBreak/>
+      </w:r>
       <w:r>
         <w:t>概述</w:t>
       </w:r>
@@ -432,6 +435,9 @@
       <w:pPr>
         <w:jc w:val="center"/>
       </w:pPr>
+      <w:r>
+        <w:lastRenderedPageBreak/>
+      </w:r>
       <w:r>
         <w:drawing>
           <wp:inline xmlns:a="http://schemas.openxmlformats.org/drawingml/2006/main" xmlns:pic="http://schemas.openxmlformats.org/drawingml/2006/picture">
@@ -1027,6 +1033,9 @@
     </w:p>
     <w:p>
       <w:r>
+        <w:lastRenderedPageBreak/>
+      </w:r>
+      <w:r>
         <mc:AlternateContent>
           <mc:Choice Requires="wps">
             <w:drawing>
@@ -1176,6 +1185,9 @@
       <w:pPr>
         <w:pStyle w:val="Heading1"/>
       </w:pPr>
+      <w:r>
+        <w:lastRenderedPageBreak/>
+      </w:r>
       <w:r>
         <w:t>非功能需求</w:t>
       </w:r>
@@ -1529,7 +1541,7 @@
 
 <file path=word/comments.xml><?xml version="1.0" encoding="utf-8"?>
 <w:comments xmlns:a="http://schemas.openxmlformats.org/drawingml/2006/main" xmlns:pic="http://schemas.openxmlformats.org/drawingml/2006/picture" xmlns:r="http://schemas.openxmlformats.org/officeDocument/2006/relationships" xmlns:w="http://schemas.openxmlformats.org/wordprocessingml/2006/main" xmlns:wp="http://schemas.openxmlformats.org/drawingml/2006/wordprocessingDrawing" xmlns:mc="http://schemas.openxmlformats.org/markup-compatibility/2006" xmlns:a14="http://schemas.microsoft.com/office/drawing/2010/main" xmlns:w14="http://schemas.microsoft.com/office/word/2010/wordml" xmlns:wpc="http://schemas.microsoft.com/office/word/2010/wordprocessingCanvas">
-  <w:comment w:id="0" w:author="示例审阅人" w:initials="SL" w:date="2026-09-24T11:09:06Z">
+  <w:comment w:id="0" w:author="示例审阅人" w:initials="SL" w:date="2026-09-01T09:00:00Z">
     <w:p>
       <w:pPr>
         <w:pStyle w:val="CommentText"/>

</xml_diff>